<commit_message>
1.21.0: redesigned money templates
</commit_message>
<xml_diff>
--- a/samples/credit-note.docx
+++ b/samples/credit-note.docx
@@ -2,144 +2,161 @@
 <file path=word/document.xml><?xml version="1.0" encoding="utf-8"?>
 <w:document xmlns:wpc="http://schemas.microsoft.com/office/word/2010/wordprocessingCanvas" xmlns:mc="http://schemas.openxmlformats.org/markup-compatibility/2006" xmlns:o="urn:schemas-microsoft-com:office:office" xmlns:r="http://schemas.openxmlformats.org/officeDocument/2006/relationships" xmlns:m="http://schemas.openxmlformats.org/officeDocument/2006/math" xmlns:v="urn:schemas-microsoft-com:vml" xmlns:wp14="http://schemas.microsoft.com/office/word/2010/wordprocessingDrawing" xmlns:wp="http://schemas.openxmlformats.org/drawingml/2006/wordprocessingDrawing" xmlns:w10="urn:schemas-microsoft-com:office:word" xmlns:w="http://schemas.openxmlformats.org/wordprocessingml/2006/main" xmlns:w14="http://schemas.microsoft.com/office/word/2010/wordml" xmlns:w15="http://schemas.microsoft.com/office/word/2012/wordml" xmlns:wpg="http://schemas.microsoft.com/office/word/2010/wordprocessingGroup" xmlns:wpi="http://schemas.microsoft.com/office/word/2010/wordprocessingInk" xmlns:wne="http://schemas.microsoft.com/office/word/2006/wordml" xmlns:wps="http://schemas.microsoft.com/office/word/2010/wordprocessingShape" xmlns:cx="http://schemas.microsoft.com/office/drawing/2014/chartex" xmlns:cx1="http://schemas.microsoft.com/office/drawing/2015/9/8/chartex" xmlns:cx2="http://schemas.microsoft.com/office/drawing/2015/10/21/chartex" xmlns:cx3="http://schemas.microsoft.com/office/drawing/2016/5/9/chartex" xmlns:cx4="http://schemas.microsoft.com/office/drawing/2016/5/10/chartex" xmlns:cx5="http://schemas.microsoft.com/office/drawing/2016/5/11/chartex" xmlns:cx6="http://schemas.microsoft.com/office/drawing/2016/5/12/chartex" xmlns:cx7="http://schemas.microsoft.com/office/drawing/2016/5/13/chartex" xmlns:cx8="http://schemas.microsoft.com/office/drawing/2016/5/14/chartex" xmlns:aink="http://schemas.microsoft.com/office/drawing/2016/ink" xmlns:am3d="http://schemas.microsoft.com/office/drawing/2017/model3d" xmlns:w16cex="http://schemas.microsoft.com/office/word/2018/wordml/cex" xmlns:w16cid="http://schemas.microsoft.com/office/word/2016/wordml/cid" xmlns:w16="http://schemas.microsoft.com/office/word/2018/wordml" xmlns:w16sdtdh="http://schemas.microsoft.com/office/word/2020/wordml/sdtdatahash" xmlns:w16se="http://schemas.microsoft.com/office/word/2015/wordml/symex" mc:Ignorable="w14 w15 wp14">
   <w:body>
-    <w:p>
-      <w:pPr>
-        <w:pStyle w:val="Title"/>
-        <w:spacing w:after="240"/>
-        <w:jc w:val="center"/>
-      </w:pPr>
-      <w:r>
-        <w:t xml:space="preserve">CREDIT NOTE</w:t>
-      </w:r>
-    </w:p>
-    <w:p>
-      <w:pPr>
-        <w:spacing w:after="160"/>
-      </w:pPr>
-      <w:r>
-        <w:t xml:space="preserve">{business_name}</w:t>
-      </w:r>
-    </w:p>
-    <w:p>
-      <w:pPr>
-        <w:spacing w:after="160"/>
-      </w:pPr>
-      <w:r>
-        <w:t xml:space="preserve">{business_address}</w:t>
-      </w:r>
-    </w:p>
-    <w:p>
-      <w:pPr>
-        <w:spacing w:after="160"/>
-      </w:pPr>
-      <w:r>
-        <w:t xml:space="preserve">Credit note number: {credit_note_number}</w:t>
-      </w:r>
-    </w:p>
-    <w:p>
-      <w:pPr>
-        <w:spacing w:after="160"/>
-      </w:pPr>
-      <w:r>
-        <w:t xml:space="preserve">Date: {credit_note_date}</w:t>
-      </w:r>
-    </w:p>
-    <w:p>
-      <w:pPr>
-        <w:spacing w:after="160"/>
-      </w:pPr>
-      <w:r>
-        <w:t xml:space="preserve">Original invoice: {original_invoice_number}, dated {original_invoice_date}</w:t>
-      </w:r>
-    </w:p>
-    <w:p>
-      <w:pPr>
-        <w:pStyle w:val="Heading1"/>
-        <w:spacing w:after="160" w:before="240"/>
-      </w:pPr>
-      <w:r>
-        <w:t xml:space="preserve">Credit to</w:t>
-      </w:r>
-    </w:p>
-    <w:p>
-      <w:pPr>
-        <w:spacing w:after="160"/>
-      </w:pPr>
-      <w:r>
-        <w:t xml:space="preserve">{customer_name}</w:t>
-      </w:r>
-    </w:p>
-    <w:p>
-      <w:pPr>
-        <w:spacing w:after="160"/>
-      </w:pPr>
-      <w:r>
-        <w:t xml:space="preserve">{customer_address}</w:t>
-      </w:r>
-    </w:p>
-    <w:p>
-      <w:pPr>
-        <w:pStyle w:val="Heading1"/>
-        <w:spacing w:after="160" w:before="240"/>
-      </w:pPr>
-      <w:r>
-        <w:t xml:space="preserve">Reason</w:t>
-      </w:r>
-    </w:p>
-    <w:p>
-      <w:pPr>
-        <w:spacing w:after="160"/>
-      </w:pPr>
-      <w:r>
-        <w:t xml:space="preserve">{credit_reason}</w:t>
-      </w:r>
-    </w:p>
-    <w:p>
-      <w:pPr>
-        <w:pStyle w:val="Heading1"/>
-        <w:spacing w:after="160" w:before="240"/>
-      </w:pPr>
-      <w:r>
-        <w:t xml:space="preserve">Credited items</w:t>
-      </w:r>
-    </w:p>
-    <w:p>
-      <w:r>
-        <w:t xml:space="preserve">{#credited_items}</w:t>
-      </w:r>
-    </w:p>
-    <w:p>
-      <w:pPr>
-        <w:pStyle w:val="ListParagraph"/>
-        <w:numPr>
-          <w:ilvl w:val="0"/>
-          <w:numId w:val="1"/>
-        </w:numPr>
-        <w:spacing w:after="80"/>
-      </w:pPr>
-      <w:r>
-        <w:t xml:space="preserve">{credited_item_description}: {credited_item_amount}</w:t>
-      </w:r>
-    </w:p>
-    <w:p>
-      <w:r>
-        <w:t xml:space="preserve">{/credited_items}</w:t>
-      </w:r>
-    </w:p>
-    <w:p>
-      <w:pPr>
-        <w:spacing w:after="160"/>
-      </w:pPr>
-      <w:r>
-        <w:t xml:space="preserve">Subtotal: {subtotal_amount}</w:t>
-      </w:r>
-    </w:p>
-    <w:p>
-      <w:pPr>
-        <w:spacing w:after="160"/>
-      </w:pPr>
-      <w:r>
-        <w:t xml:space="preserve">{#includes_tax}{tax_name}: {tax_amount}{/includes_tax}</w:t>
+    <w:tbl>
+      <w:tblPr>
+        <w:tblW w:type="dxa" w:w="9000"/>
+        <w:tblBorders>
+          <w:top w:val="none" w:color="FFFFFF" w:sz="0"/>
+          <w:left w:val="none" w:color="FFFFFF" w:sz="0"/>
+          <w:bottom w:val="none" w:color="FFFFFF" w:sz="0"/>
+          <w:right w:val="none" w:color="FFFFFF" w:sz="0"/>
+          <w:insideH w:val="none" w:color="FFFFFF" w:sz="0"/>
+          <w:insideV w:val="none" w:color="FFFFFF" w:sz="0"/>
+        </w:tblBorders>
+        <w:tblLayout w:type="fixed"/>
+      </w:tblPr>
+      <w:tblGrid>
+        <w:gridCol w:w="4800"/>
+        <w:gridCol w:w="4200"/>
+      </w:tblGrid>
+      <w:tr>
+        <w:tc>
+          <w:tcPr>
+            <w:tcW w:type="dxa" w:w="4800"/>
+            <w:tcMar>
+              <w:top w:type="dxa" w:w="70"/>
+              <w:left w:type="dxa" w:w="110"/>
+              <w:bottom w:type="dxa" w:w="70"/>
+              <w:right w:type="dxa" w:w="110"/>
+            </w:tcMar>
+          </w:tcPr>
+          <w:p>
+            <w:pPr>
+              <w:spacing w:after="80"/>
+            </w:pPr>
+            <w:r>
+              <w:rPr>
+                <w:b/>
+                <w:bCs/>
+                <w:color w:val="1B2A41"/>
+                <w:sz w:val="28"/>
+                <w:szCs w:val="28"/>
+              </w:rPr>
+              <w:t xml:space="preserve">{business_name}</w:t>
+            </w:r>
+          </w:p>
+          <w:p>
+            <w:pPr>
+              <w:spacing w:after="40"/>
+            </w:pPr>
+            <w:r>
+              <w:rPr>
+                <w:b w:val="false"/>
+                <w:bCs w:val="false"/>
+              </w:rPr>
+              <w:t xml:space="preserve">{business_address}</w:t>
+            </w:r>
+          </w:p>
+        </w:tc>
+        <w:tc>
+          <w:tcPr>
+            <w:tcW w:type="dxa" w:w="4200"/>
+            <w:tcMar>
+              <w:top w:type="dxa" w:w="70"/>
+              <w:left w:type="dxa" w:w="110"/>
+              <w:bottom w:type="dxa" w:w="70"/>
+              <w:right w:type="dxa" w:w="110"/>
+            </w:tcMar>
+          </w:tcPr>
+          <w:p>
+            <w:pPr>
+              <w:spacing w:after="120"/>
+              <w:jc w:val="right"/>
+            </w:pPr>
+            <w:r>
+              <w:rPr>
+                <w:b/>
+                <w:bCs/>
+                <w:color w:val="1B2A41"/>
+                <w:sz w:val="40"/>
+                <w:szCs w:val="40"/>
+              </w:rPr>
+              <w:t xml:space="preserve">CREDIT NOTE</w:t>
+            </w:r>
+          </w:p>
+          <w:p>
+            <w:pPr>
+              <w:spacing w:after="40"/>
+              <w:jc w:val="right"/>
+            </w:pPr>
+            <w:r>
+              <w:rPr>
+                <w:b w:val="false"/>
+                <w:bCs w:val="false"/>
+              </w:rPr>
+              <w:t xml:space="preserve">Credit note number: {credit_note_number}</w:t>
+            </w:r>
+          </w:p>
+          <w:p>
+            <w:pPr>
+              <w:spacing w:after="40"/>
+              <w:jc w:val="right"/>
+            </w:pPr>
+            <w:r>
+              <w:rPr>
+                <w:b w:val="false"/>
+                <w:bCs w:val="false"/>
+              </w:rPr>
+              <w:t xml:space="preserve">Date: {credit_note_date}</w:t>
+            </w:r>
+          </w:p>
+          <w:p>
+            <w:pPr>
+              <w:spacing w:after="40"/>
+              <w:jc w:val="right"/>
+            </w:pPr>
+            <w:r>
+              <w:rPr>
+                <w:b w:val="false"/>
+                <w:bCs w:val="false"/>
+              </w:rPr>
+              <w:t xml:space="preserve">Original invoice: {original_invoice_number}</w:t>
+            </w:r>
+          </w:p>
+          <w:p>
+            <w:pPr>
+              <w:spacing w:after="40"/>
+              <w:jc w:val="right"/>
+            </w:pPr>
+            <w:r>
+              <w:rPr>
+                <w:b w:val="false"/>
+                <w:bCs w:val="false"/>
+              </w:rPr>
+              <w:t xml:space="preserve">Invoice date: {original_invoice_date}</w:t>
+            </w:r>
+          </w:p>
+        </w:tc>
+      </w:tr>
+    </w:tbl>
+    <w:p>
+      <w:pPr>
+        <w:spacing w:after="200"/>
+      </w:pPr>
+    </w:p>
+    <w:p>
+      <w:pPr>
+        <w:spacing w:after="60" w:before="120"/>
+      </w:pPr>
+      <w:r>
+        <w:rPr>
+          <w:b/>
+          <w:bCs/>
+          <w:color w:val="1B2A41"/>
+          <w:sz w:val="18"/>
+          <w:szCs w:val="18"/>
+        </w:rPr>
+        <w:t xml:space="preserve">CREDIT TO</w:t>
       </w:r>
     </w:p>
     <w:p>
@@ -151,16 +168,414 @@
           <w:b/>
           <w:bCs/>
         </w:rPr>
-        <w:t xml:space="preserve">Total credit: {total_credit_amount}</w:t>
-      </w:r>
-    </w:p>
-    <w:p>
-      <w:pPr>
-        <w:pStyle w:val="Heading1"/>
-        <w:spacing w:after="160" w:before="240"/>
-      </w:pPr>
-      <w:r>
-        <w:t xml:space="preserve">How the credit is applied</w:t>
+        <w:t xml:space="preserve">{customer_name}</w:t>
+      </w:r>
+    </w:p>
+    <w:p>
+      <w:pPr>
+        <w:spacing w:after="160"/>
+      </w:pPr>
+      <w:r>
+        <w:t xml:space="preserve">{customer_address}</w:t>
+      </w:r>
+    </w:p>
+    <w:p>
+      <w:pPr>
+        <w:spacing w:after="60" w:before="120"/>
+      </w:pPr>
+      <w:r>
+        <w:rPr>
+          <w:b/>
+          <w:bCs/>
+          <w:color w:val="1B2A41"/>
+          <w:sz w:val="18"/>
+          <w:szCs w:val="18"/>
+        </w:rPr>
+        <w:t xml:space="preserve">REASON</w:t>
+      </w:r>
+    </w:p>
+    <w:p>
+      <w:pPr>
+        <w:spacing w:after="160"/>
+      </w:pPr>
+      <w:r>
+        <w:t xml:space="preserve">{credit_reason}</w:t>
+      </w:r>
+    </w:p>
+    <w:tbl>
+      <w:tblPr>
+        <w:tblW w:type="dxa" w:w="9000"/>
+        <w:tblBorders>
+          <w:top w:val="none" w:color="FFFFFF" w:sz="0"/>
+          <w:left w:val="none" w:color="FFFFFF" w:sz="0"/>
+          <w:bottom w:val="none" w:color="FFFFFF" w:sz="0"/>
+          <w:right w:val="none" w:color="FFFFFF" w:sz="0"/>
+          <w:insideH w:val="none" w:color="FFFFFF" w:sz="0"/>
+          <w:insideV w:val="none" w:color="FFFFFF" w:sz="0"/>
+        </w:tblBorders>
+        <w:tblLayout w:type="fixed"/>
+      </w:tblPr>
+      <w:tblGrid>
+        <w:gridCol w:w="7200"/>
+        <w:gridCol w:w="1800"/>
+      </w:tblGrid>
+      <w:tr>
+        <w:trPr>
+          <w:tblHeader/>
+        </w:trPr>
+        <w:tc>
+          <w:tcPr>
+            <w:tcW w:type="dxa" w:w="7200"/>
+            <w:tcBorders>
+              <w:top w:val="none" w:color="FFFFFF" w:sz="0"/>
+              <w:left w:val="none" w:color="FFFFFF" w:sz="0"/>
+              <w:bottom w:val="none" w:color="FFFFFF" w:sz="0"/>
+              <w:right w:val="none" w:color="FFFFFF" w:sz="0"/>
+            </w:tcBorders>
+            <w:shd w:fill="1B2A41" w:color="auto" w:val="clear"/>
+            <w:tcMar>
+              <w:top w:type="dxa" w:w="70"/>
+              <w:left w:type="dxa" w:w="110"/>
+              <w:bottom w:type="dxa" w:w="70"/>
+              <w:right w:type="dxa" w:w="110"/>
+            </w:tcMar>
+          </w:tcPr>
+          <w:p>
+            <w:pPr>
+              <w:spacing w:after="40"/>
+            </w:pPr>
+            <w:r>
+              <w:rPr>
+                <w:b/>
+                <w:bCs/>
+                <w:color w:val="FFFFFF"/>
+              </w:rPr>
+              <w:t xml:space="preserve">Credited item</w:t>
+            </w:r>
+          </w:p>
+        </w:tc>
+        <w:tc>
+          <w:tcPr>
+            <w:tcW w:type="dxa" w:w="1800"/>
+            <w:tcBorders>
+              <w:top w:val="none" w:color="FFFFFF" w:sz="0"/>
+              <w:left w:val="none" w:color="FFFFFF" w:sz="0"/>
+              <w:bottom w:val="none" w:color="FFFFFF" w:sz="0"/>
+              <w:right w:val="none" w:color="FFFFFF" w:sz="0"/>
+            </w:tcBorders>
+            <w:shd w:fill="1B2A41" w:color="auto" w:val="clear"/>
+            <w:tcMar>
+              <w:top w:type="dxa" w:w="70"/>
+              <w:left w:type="dxa" w:w="110"/>
+              <w:bottom w:type="dxa" w:w="70"/>
+              <w:right w:type="dxa" w:w="110"/>
+            </w:tcMar>
+          </w:tcPr>
+          <w:p>
+            <w:pPr>
+              <w:spacing w:after="40"/>
+              <w:jc w:val="right"/>
+            </w:pPr>
+            <w:r>
+              <w:rPr>
+                <w:b/>
+                <w:bCs/>
+                <w:color w:val="FFFFFF"/>
+              </w:rPr>
+              <w:t xml:space="preserve">Amount</w:t>
+            </w:r>
+          </w:p>
+        </w:tc>
+      </w:tr>
+      <w:tr>
+        <w:tc>
+          <w:tcPr>
+            <w:tcW w:type="dxa" w:w="7200"/>
+            <w:tcBorders>
+              <w:top w:val="none" w:color="FFFFFF" w:sz="0"/>
+              <w:left w:val="none" w:color="FFFFFF" w:sz="0"/>
+              <w:bottom w:val="single" w:color="D0D7E2" w:sz="4"/>
+              <w:right w:val="none" w:color="FFFFFF" w:sz="0"/>
+            </w:tcBorders>
+            <w:tcMar>
+              <w:top w:type="dxa" w:w="70"/>
+              <w:left w:type="dxa" w:w="110"/>
+              <w:bottom w:type="dxa" w:w="70"/>
+              <w:right w:type="dxa" w:w="110"/>
+            </w:tcMar>
+          </w:tcPr>
+          <w:p>
+            <w:pPr>
+              <w:spacing w:after="40"/>
+            </w:pPr>
+            <w:r>
+              <w:rPr>
+                <w:b w:val="false"/>
+                <w:bCs w:val="false"/>
+              </w:rPr>
+              <w:t xml:space="preserve">{#credited_items}{credited_item_description}</w:t>
+            </w:r>
+          </w:p>
+        </w:tc>
+        <w:tc>
+          <w:tcPr>
+            <w:tcW w:type="dxa" w:w="1800"/>
+            <w:tcBorders>
+              <w:top w:val="none" w:color="FFFFFF" w:sz="0"/>
+              <w:left w:val="none" w:color="FFFFFF" w:sz="0"/>
+              <w:bottom w:val="single" w:color="D0D7E2" w:sz="4"/>
+              <w:right w:val="none" w:color="FFFFFF" w:sz="0"/>
+            </w:tcBorders>
+            <w:tcMar>
+              <w:top w:type="dxa" w:w="70"/>
+              <w:left w:type="dxa" w:w="110"/>
+              <w:bottom w:type="dxa" w:w="70"/>
+              <w:right w:type="dxa" w:w="110"/>
+            </w:tcMar>
+          </w:tcPr>
+          <w:p>
+            <w:pPr>
+              <w:spacing w:after="40"/>
+              <w:jc w:val="right"/>
+            </w:pPr>
+            <w:r>
+              <w:rPr>
+                <w:b w:val="false"/>
+                <w:bCs w:val="false"/>
+              </w:rPr>
+              <w:t xml:space="preserve">{credited_item_amount}{/credited_items}</w:t>
+            </w:r>
+          </w:p>
+        </w:tc>
+      </w:tr>
+    </w:tbl>
+    <w:p>
+      <w:pPr>
+        <w:spacing w:after="120"/>
+      </w:pPr>
+    </w:p>
+    <w:tbl>
+      <w:tblPr>
+        <w:tblW w:type="dxa" w:w="4600"/>
+        <w:jc w:val="right"/>
+        <w:tblBorders>
+          <w:top w:val="none" w:color="FFFFFF" w:sz="0"/>
+          <w:left w:val="none" w:color="FFFFFF" w:sz="0"/>
+          <w:bottom w:val="none" w:color="FFFFFF" w:sz="0"/>
+          <w:right w:val="none" w:color="FFFFFF" w:sz="0"/>
+          <w:insideH w:val="none" w:color="FFFFFF" w:sz="0"/>
+          <w:insideV w:val="none" w:color="FFFFFF" w:sz="0"/>
+        </w:tblBorders>
+        <w:tblLayout w:type="fixed"/>
+      </w:tblPr>
+      <w:tblGrid>
+        <w:gridCol w:w="2700"/>
+        <w:gridCol w:w="1900"/>
+      </w:tblGrid>
+      <w:tr>
+        <w:tc>
+          <w:tcPr>
+            <w:tcW w:type="dxa" w:w="2700"/>
+            <w:tcBorders>
+              <w:top w:val="none" w:color="FFFFFF" w:sz="0"/>
+              <w:left w:val="none" w:color="FFFFFF" w:sz="0"/>
+              <w:bottom w:val="none" w:color="FFFFFF" w:sz="0"/>
+              <w:right w:val="none" w:color="FFFFFF" w:sz="0"/>
+            </w:tcBorders>
+            <w:tcMar>
+              <w:top w:type="dxa" w:w="70"/>
+              <w:left w:type="dxa" w:w="110"/>
+              <w:bottom w:type="dxa" w:w="70"/>
+              <w:right w:type="dxa" w:w="110"/>
+            </w:tcMar>
+          </w:tcPr>
+          <w:p>
+            <w:pPr>
+              <w:spacing w:after="40"/>
+            </w:pPr>
+            <w:r>
+              <w:rPr>
+                <w:b w:val="false"/>
+                <w:bCs w:val="false"/>
+              </w:rPr>
+              <w:t xml:space="preserve">Subtotal</w:t>
+            </w:r>
+          </w:p>
+        </w:tc>
+        <w:tc>
+          <w:tcPr>
+            <w:tcW w:type="dxa" w:w="1900"/>
+            <w:tcBorders>
+              <w:top w:val="none" w:color="FFFFFF" w:sz="0"/>
+              <w:left w:val="none" w:color="FFFFFF" w:sz="0"/>
+              <w:bottom w:val="none" w:color="FFFFFF" w:sz="0"/>
+              <w:right w:val="none" w:color="FFFFFF" w:sz="0"/>
+            </w:tcBorders>
+            <w:tcMar>
+              <w:top w:type="dxa" w:w="70"/>
+              <w:left w:type="dxa" w:w="110"/>
+              <w:bottom w:type="dxa" w:w="70"/>
+              <w:right w:type="dxa" w:w="110"/>
+            </w:tcMar>
+          </w:tcPr>
+          <w:p>
+            <w:pPr>
+              <w:spacing w:after="40"/>
+              <w:jc w:val="right"/>
+            </w:pPr>
+            <w:r>
+              <w:rPr>
+                <w:b w:val="false"/>
+                <w:bCs w:val="false"/>
+              </w:rPr>
+              <w:t xml:space="preserve">{subtotal_amount}</w:t>
+            </w:r>
+          </w:p>
+        </w:tc>
+      </w:tr>
+      <w:tr>
+        <w:tc>
+          <w:tcPr>
+            <w:tcW w:type="dxa" w:w="2700"/>
+            <w:tcBorders>
+              <w:top w:val="none" w:color="FFFFFF" w:sz="0"/>
+              <w:left w:val="none" w:color="FFFFFF" w:sz="0"/>
+              <w:bottom w:val="none" w:color="FFFFFF" w:sz="0"/>
+              <w:right w:val="none" w:color="FFFFFF" w:sz="0"/>
+            </w:tcBorders>
+            <w:tcMar>
+              <w:top w:type="dxa" w:w="70"/>
+              <w:left w:type="dxa" w:w="110"/>
+              <w:bottom w:type="dxa" w:w="70"/>
+              <w:right w:type="dxa" w:w="110"/>
+            </w:tcMar>
+          </w:tcPr>
+          <w:p>
+            <w:pPr>
+              <w:spacing w:after="40"/>
+            </w:pPr>
+            <w:r>
+              <w:rPr>
+                <w:b w:val="false"/>
+                <w:bCs w:val="false"/>
+              </w:rPr>
+              <w:t xml:space="preserve">{#includes_tax}{tax_name} ({tax_rate}%)</w:t>
+            </w:r>
+          </w:p>
+        </w:tc>
+        <w:tc>
+          <w:tcPr>
+            <w:tcW w:type="dxa" w:w="1900"/>
+            <w:tcBorders>
+              <w:top w:val="none" w:color="FFFFFF" w:sz="0"/>
+              <w:left w:val="none" w:color="FFFFFF" w:sz="0"/>
+              <w:bottom w:val="none" w:color="FFFFFF" w:sz="0"/>
+              <w:right w:val="none" w:color="FFFFFF" w:sz="0"/>
+            </w:tcBorders>
+            <w:tcMar>
+              <w:top w:type="dxa" w:w="70"/>
+              <w:left w:type="dxa" w:w="110"/>
+              <w:bottom w:type="dxa" w:w="70"/>
+              <w:right w:type="dxa" w:w="110"/>
+            </w:tcMar>
+          </w:tcPr>
+          <w:p>
+            <w:pPr>
+              <w:spacing w:after="40"/>
+              <w:jc w:val="right"/>
+            </w:pPr>
+            <w:r>
+              <w:rPr>
+                <w:b w:val="false"/>
+                <w:bCs w:val="false"/>
+              </w:rPr>
+              <w:t xml:space="preserve">{tax_amount}{/includes_tax}</w:t>
+            </w:r>
+          </w:p>
+        </w:tc>
+      </w:tr>
+      <w:tr>
+        <w:tc>
+          <w:tcPr>
+            <w:tcW w:type="dxa" w:w="2700"/>
+            <w:tcBorders>
+              <w:top w:val="single" w:color="1B2A41" w:sz="8"/>
+              <w:left w:val="none" w:color="FFFFFF" w:sz="0"/>
+              <w:bottom w:val="none" w:color="FFFFFF" w:sz="0"/>
+              <w:right w:val="none" w:color="FFFFFF" w:sz="0"/>
+            </w:tcBorders>
+            <w:shd w:fill="EEF2F7" w:color="auto" w:val="clear"/>
+            <w:tcMar>
+              <w:top w:type="dxa" w:w="70"/>
+              <w:left w:type="dxa" w:w="110"/>
+              <w:bottom w:type="dxa" w:w="70"/>
+              <w:right w:type="dxa" w:w="110"/>
+            </w:tcMar>
+          </w:tcPr>
+          <w:p>
+            <w:pPr>
+              <w:spacing w:after="40"/>
+            </w:pPr>
+            <w:r>
+              <w:rPr>
+                <w:b/>
+                <w:bCs/>
+              </w:rPr>
+              <w:t xml:space="preserve">Total credit</w:t>
+            </w:r>
+          </w:p>
+        </w:tc>
+        <w:tc>
+          <w:tcPr>
+            <w:tcW w:type="dxa" w:w="1900"/>
+            <w:tcBorders>
+              <w:top w:val="single" w:color="1B2A41" w:sz="8"/>
+              <w:left w:val="none" w:color="FFFFFF" w:sz="0"/>
+              <w:bottom w:val="none" w:color="FFFFFF" w:sz="0"/>
+              <w:right w:val="none" w:color="FFFFFF" w:sz="0"/>
+            </w:tcBorders>
+            <w:shd w:fill="EEF2F7" w:color="auto" w:val="clear"/>
+            <w:tcMar>
+              <w:top w:type="dxa" w:w="70"/>
+              <w:left w:type="dxa" w:w="110"/>
+              <w:bottom w:type="dxa" w:w="70"/>
+              <w:right w:type="dxa" w:w="110"/>
+            </w:tcMar>
+          </w:tcPr>
+          <w:p>
+            <w:pPr>
+              <w:spacing w:after="40"/>
+              <w:jc w:val="right"/>
+            </w:pPr>
+            <w:r>
+              <w:rPr>
+                <w:b/>
+                <w:bCs/>
+              </w:rPr>
+              <w:t xml:space="preserve">{total_credit_amount}</w:t>
+            </w:r>
+          </w:p>
+        </w:tc>
+      </w:tr>
+    </w:tbl>
+    <w:p>
+      <w:pPr>
+        <w:spacing w:after="200"/>
+      </w:pPr>
+    </w:p>
+    <w:p>
+      <w:pPr>
+        <w:spacing w:after="60" w:before="120"/>
+      </w:pPr>
+      <w:r>
+        <w:rPr>
+          <w:b/>
+          <w:bCs/>
+          <w:color w:val="1B2A41"/>
+          <w:sz w:val="18"/>
+          <w:szCs w:val="18"/>
+        </w:rPr>
+        <w:t xml:space="preserve">HOW THE CREDIT IS APPLIED</w:t>
       </w:r>
     </w:p>
     <w:p>

</xml_diff>